<commit_message>
Radar 2: update retrospective Word report
</commit_message>
<xml_diff>
--- a/stuff/WHAT_WAS_EXPECTED_WHAT_HAPPENED.docx
+++ b/stuff/WHAT_WAS_EXPECTED_WHAT_HAPPENED.docx
@@ -25,12 +25,12 @@
         <w:pStyle w:val="Heading2"/>
       </w:pPr>
       <w:r>
-        <w:t>1. EU working-age population</w:t>
+        <w:t>1. 2025 Strategic Foresight Report</w:t>
       </w:r>
     </w:p>
     <w:p>
       <w:r>
-        <w:t>What was expected: The EU is projected to have 17 million fewer people of working age in 2040 than in 2023.</w:t>
+        <w:t>What was expected: the EU is projected to have 17 million fewer people of working age by 2040 than in 2023 (33).</w:t>
       </w:r>
     </w:p>
     <w:p>
@@ -48,37 +48,6 @@
         <w:pStyle w:val="Caption"/>
       </w:pPr>
       <w:r>
-        <w:t>Original: https://commission.europa.eu/strategy-and-policy/strategic-foresight/2025-strategic-foresight-report_en</w:t>
-      </w:r>
-    </w:p>
-    <w:p>
-      <w:pPr>
-        <w:pStyle w:val="Heading2"/>
-      </w:pPr>
-      <w:r>
-        <w:t>2. 2025 Strategic Foresight Report</w:t>
-      </w:r>
-    </w:p>
-    <w:p>
-      <w:r>
-        <w:t>What was expected: Healthy longevity offers various opportunities but also challenges, particularly when coupled with the parallel decline in fertility rates (32); the EU is projected to have 17 million fewer people of working age by 2040 than in 2023 (33).</w:t>
-      </w:r>
-    </w:p>
-    <w:p>
-      <w:r>
-        <w:t>What happened: No independently verified outcome yet.</w:t>
-      </w:r>
-    </w:p>
-    <w:p>
-      <w:r>
-        <w:t>Foresight score: Not scored — not yet assessed</w:t>
-      </w:r>
-    </w:p>
-    <w:p>
-      <w:pPr>
-        <w:pStyle w:val="Caption"/>
-      </w:pPr>
-      <w:r>
         <w:t>Original: https://commission.europa.eu/document/download/bdba60f0-abb3-42f8-b5be-fd35d693b289_en?filename=SFR2025-Report_web.pdf</w:t>
       </w:r>
     </w:p>
@@ -87,7 +56,7 @@
         <w:pStyle w:val="Heading2"/>
       </w:pPr>
       <w:r>
-        <w:t>3. 2023 Strategic Foresight Report</w:t>
+        <w:t>2. 2023 Strategic Foresight Report</w:t>
       </w:r>
     </w:p>
     <w:p>
@@ -118,7 +87,7 @@
         <w:pStyle w:val="Heading2"/>
       </w:pPr>
       <w:r>
-        <w:t>4. What if...? Scanning the horizon: 12 scenarios for 2021</w:t>
+        <w:t>3. What if...? Scanning the horizon: 12 scenarios for 2021</w:t>
       </w:r>
     </w:p>
     <w:p>
@@ -149,7 +118,7 @@
         <w:pStyle w:val="Heading2"/>
       </w:pPr>
       <w:r>
-        <w:t>5. Skills forecast: trends and challenges to 2030</w:t>
+        <w:t>4. Skills forecast: trends and challenges to 2030</w:t>
       </w:r>
     </w:p>
     <w:p>

</xml_diff>